<commit_message>
Revisi terminologi: ganti istilah 'indikator' menjadi 'aspek' sesuai kaidah penelitian kualitatif pada seluruh kisi-kisi & instrumen
</commit_message>
<xml_diff>
--- a/Kisi-kisi dan Instrumen Penelitian - SD Muhammadiyah Condongcatur.docx
+++ b/Kisi-kisi dan Instrumen Penelitian - SD Muhammadiyah Condongcatur.docx
@@ -131,7 +131,7 @@
           <w:b w:val="0"/>
           <w:sz w:val="24"/>
         </w:rPr>
-        <w:t>Kisi-kisi instrumen diturunkan dari dua fokus utama, yaitu (1) strategi manajemen reputasi yang mencakup tahap perencanaan, pelaksanaan, serta pemantauan dan evaluasi; dan (2) penguatan keunggulan kompetitif. Dimensi reputasi (mutu, moral/etika, tata kelola, dan citra) serta indikator keunggulan kompetitif (diferensiasi, nilai, daya tarik, dan keberlanjutan) digunakan sebagai acuan penyusunan butir instrumen, dilengkapi dengan faktor pendukung dan penghambat.</w:t>
+        <w:t>Kisi-kisi instrumen diturunkan dari dua fokus utama, yaitu (1) strategi manajemen reputasi yang mencakup tahap perencanaan, pelaksanaan, serta pemantauan dan evaluasi; dan (2) penguatan keunggulan kompetitif. Dimensi reputasi (mutu, moral/etika, tata kelola, dan citra) serta aspek keunggulan kompetitif (diferensiasi, nilai, daya tarik, dan keberlanjutan) digunakan sebagai acuan penyusunan butir instrumen, dilengkapi dengan faktor pendukung dan penghambat.</w:t>
       </w:r>
     </w:p>
     <w:p>
@@ -188,7 +188,7 @@
           <w:b w:val="0"/>
           <w:sz w:val="24"/>
         </w:rPr>
-        <w:t>Kisi-kisi umum berikut memetakan keterkaitan antara fokus penelitian, sub-fokus, indikator, teknik pengumpulan data, dan sumber data sebagaimana disajikan pada Tabel 1.</w:t>
+        <w:t>Kisi-kisi umum berikut memetakan keterkaitan antara fokus penelitian, sub-fokus, aspek, teknik pengumpulan data, dan sumber data sebagaimana disajikan pada Tabel 1.</w:t>
       </w:r>
     </w:p>
     <w:p>
@@ -279,7 +279,7 @@
                 <w:b/>
                 <w:sz w:val="20"/>
               </w:rPr>
-              <w:t>Indikator</w:t>
+              <w:t>Aspek</w:t>
             </w:r>
           </w:p>
         </w:tc>
@@ -1017,7 +1017,7 @@
                 <w:b/>
                 <w:sz w:val="20"/>
               </w:rPr>
-              <w:t>Indikator</w:t>
+              <w:t>Aspek</w:t>
             </w:r>
           </w:p>
         </w:tc>
@@ -1716,7 +1716,7 @@
                 <w:b/>
                 <w:sz w:val="20"/>
               </w:rPr>
-              <w:t>Indikator</w:t>
+              <w:t>Aspek</w:t>
             </w:r>
           </w:p>
         </w:tc>
@@ -2353,7 +2353,7 @@
                 <w:b/>
                 <w:sz w:val="20"/>
               </w:rPr>
-              <w:t>Indikator</w:t>
+              <w:t>Aspek</w:t>
             </w:r>
           </w:p>
         </w:tc>
@@ -3114,7 +3114,7 @@
                 <w:b/>
                 <w:sz w:val="20"/>
               </w:rPr>
-              <w:t>Indikator</w:t>
+              <w:t>Aspek</w:t>
             </w:r>
           </w:p>
         </w:tc>
@@ -3794,7 +3794,7 @@
                 <w:b/>
                 <w:sz w:val="20"/>
               </w:rPr>
-              <w:t>Indikator/Deskriptor</w:t>
+              <w:t>Deskriptor Pengamatan</w:t>
             </w:r>
           </w:p>
         </w:tc>

</xml_diff>